<commit_message>
Agrega sistema Python, página web, puente Arduino y documentos v2.0 con encabezado institucional
Co-Authored-By: Claude Sonnet 5.5 <noreply@anthropic.com>
Claude-Session: https://claude.ai/code/session_01WLZ2XuhTWTWujj27otXiLx
</commit_message>
<xml_diff>
--- a/docs/documentos/00_Indice_Maestro_v2.0.docx
+++ b/docs/documentos/00_Indice_Maestro_v2.0.docx
@@ -249,7 +249,7 @@
           <w:i w:val="0"/>
           <w:sz w:val="24"/>
         </w:rPr>
-        <w:t>El Conjunto Residencial Robles del Norte P.H., su administración, el personal de vigilancia, los residentes y todas las cifras que aparecen en este documento son ficticios. Fueron construidos por el equipo con fines académicos, tomando como referencia la literatura sobre control de acceso vehicular y la Ley 675 de 2001. No existe un cliente real ni se realizaron entrevistas, encuestas ni observaciones con terceros. Toda afirmación sobre «el cliente» es una hipótesis de trabajo del caso ilustrativo. Para redactar y organizar este documento el equipo usó Claude (Anthropic) como herramienta de apoyo; las decisiones y la revisión final corresponden al equipo y al docente.</w:t>
+        <w:t>El cliente, el conjunto «Robles del Norte P.H.» y todas las cifras de este documento son ficticios: no hubo entrevistas ni observaciones con personas reales. Lo que se dice del cliente es una hipótesis de trabajo. El equipo usó Claude (Anthropic) como apoyo; las decisiones y la revisión final son del equipo y del docente.</w:t>
       </w:r>
     </w:p>
     <w:p>
@@ -2144,6 +2144,170 @@
 
 <file path=word/header1.xml><?xml version="1.0" encoding="utf-8"?>
 <w:hdr xmlns:m="http://schemas.openxmlformats.org/officeDocument/2006/math" xmlns:mc="http://schemas.openxmlformats.org/markup-compatibility/2006" xmlns:mo="http://schemas.microsoft.com/office/mac/office/2008/main" xmlns:mv="urn:schemas-microsoft-com:mac:vml" xmlns:o="urn:schemas-microsoft-com:office:office" xmlns:r="http://schemas.openxmlformats.org/officeDocument/2006/relationships" xmlns:v="urn:schemas-microsoft-com:vml" xmlns:w10="urn:schemas-microsoft-com:office:word" xmlns:w14="http://schemas.microsoft.com/office/word/2010/wordml" xmlns:w="http://schemas.openxmlformats.org/wordprocessingml/2006/main" xmlns:wne="http://schemas.microsoft.com/office/word/2006/wordml" xmlns:wp14="http://schemas.microsoft.com/office/word/2010/wordprocessingDrawing" xmlns:wp="http://schemas.openxmlformats.org/drawingml/2006/wordprocessingDrawing" xmlns:wpc="http://schemas.microsoft.com/office/word/2010/wordprocessingCanvas" xmlns:wpg="http://schemas.microsoft.com/office/word/2010/wordprocessingGroup" xmlns:wpi="http://schemas.microsoft.com/office/word/2010/wordprocessingInk" xmlns:wps="http://schemas.microsoft.com/office/word/2010/wordprocessingShape" mc:Ignorable="w14 wp14">
+  <w:tbl>
+    <w:tblPr>
+      <w:tblW w:type="auto" w:w="0"/>
+      <w:jc w:val="center"/>
+      <w:tblLook w:firstColumn="1" w:firstRow="1" w:lastColumn="0" w:lastRow="0" w:noHBand="0" w:noVBand="1" w:val="04A0"/>
+      <w:tblBorders>
+        <w:top w:val="single" w:sz="6" w:color="000000"/>
+        <w:left w:val="single" w:sz="6" w:color="000000"/>
+        <w:bottom w:val="single" w:sz="6" w:color="000000"/>
+        <w:right w:val="single" w:sz="6" w:color="000000"/>
+        <w:insideH w:val="single" w:sz="6" w:color="000000"/>
+        <w:insideV w:val="single" w:sz="6" w:color="000000"/>
+      </w:tblBorders>
+    </w:tblPr>
+    <w:tblGrid>
+      <w:gridCol w:w="2880"/>
+      <w:gridCol w:w="2880"/>
+      <w:gridCol w:w="2880"/>
+    </w:tblGrid>
+    <w:tr>
+      <w:tc>
+        <w:tcPr>
+          <w:tcW w:type="dxa" w:w="1296"/>
+          <w:vMerge w:val="restart"/>
+        </w:tcPr>
+        <w:p>
+          <w:pPr>
+            <w:jc w:val="center"/>
+          </w:pPr>
+          <w:r>
+            <w:drawing>
+              <wp:inline xmlns:a="http://schemas.openxmlformats.org/drawingml/2006/main" xmlns:pic="http://schemas.openxmlformats.org/drawingml/2006/picture">
+                <wp:extent cx="640080" cy="602428"/>
+                <wp:docPr id="1" name="Picture 1"/>
+                <wp:cNvGraphicFramePr>
+                  <a:graphicFrameLocks noChangeAspect="1"/>
+                </wp:cNvGraphicFramePr>
+                <a:graphic>
+                  <a:graphicData uri="http://schemas.openxmlformats.org/drawingml/2006/picture">
+                    <pic:pic>
+                      <pic:nvPicPr>
+                        <pic:cNvPr id="0" name="logo_etitc.png"/>
+                        <pic:cNvPicPr/>
+                      </pic:nvPicPr>
+                      <pic:blipFill>
+                        <a:blip r:embed="rId1"/>
+                        <a:stretch>
+                          <a:fillRect/>
+                        </a:stretch>
+                      </pic:blipFill>
+                      <pic:spPr>
+                        <a:xfrm>
+                          <a:off x="0" y="0"/>
+                          <a:ext cx="640080" cy="602428"/>
+                        </a:xfrm>
+                        <a:prstGeom prst="rect"/>
+                      </pic:spPr>
+                    </pic:pic>
+                  </a:graphicData>
+                </a:graphic>
+              </wp:inline>
+            </w:drawing>
+          </w:r>
+        </w:p>
+      </w:tc>
+      <w:tc>
+        <w:tcPr>
+          <w:tcW w:type="dxa" w:w="6048"/>
+        </w:tcPr>
+        <w:p>
+          <w:pPr>
+            <w:jc w:val="center"/>
+          </w:pPr>
+          <w:r>
+            <w:rPr>
+              <w:rFonts w:ascii="Times New Roman" w:hAnsi="Times New Roman" w:cs="Times New Roman" w:eastAsia="Times New Roman"/>
+              <w:b/>
+              <w:sz w:val="18"/>
+            </w:rPr>
+            <w:t>Tecnología en Desarrollo de Software de la Escuela Tecnológica Instituto Técnico Central (ETITC)</w:t>
+          </w:r>
+        </w:p>
+      </w:tc>
+      <w:tc>
+        <w:tcPr>
+          <w:tcW w:type="dxa" w:w="1296"/>
+          <w:vMerge w:val="restart"/>
+        </w:tcPr>
+        <w:p>
+          <w:pPr>
+            <w:jc w:val="center"/>
+          </w:pPr>
+          <w:r>
+            <w:drawing>
+              <wp:inline xmlns:a="http://schemas.openxmlformats.org/drawingml/2006/main" xmlns:pic="http://schemas.openxmlformats.org/drawingml/2006/picture">
+                <wp:extent cx="640080" cy="477926"/>
+                <wp:docPr id="2" name="Picture 2"/>
+                <wp:cNvGraphicFramePr>
+                  <a:graphicFrameLocks noChangeAspect="1"/>
+                </wp:cNvGraphicFramePr>
+                <a:graphic>
+                  <a:graphicData uri="http://schemas.openxmlformats.org/drawingml/2006/picture">
+                    <pic:pic>
+                      <pic:nvPicPr>
+                        <pic:cNvPr id="0" name="logo_calidad.png"/>
+                        <pic:cNvPicPr/>
+                      </pic:nvPicPr>
+                      <pic:blipFill>
+                        <a:blip r:embed="rId2"/>
+                        <a:stretch>
+                          <a:fillRect/>
+                        </a:stretch>
+                      </pic:blipFill>
+                      <pic:spPr>
+                        <a:xfrm>
+                          <a:off x="0" y="0"/>
+                          <a:ext cx="640080" cy="477926"/>
+                        </a:xfrm>
+                        <a:prstGeom prst="rect"/>
+                      </pic:spPr>
+                    </pic:pic>
+                  </a:graphicData>
+                </a:graphic>
+              </wp:inline>
+            </w:drawing>
+          </w:r>
+        </w:p>
+      </w:tc>
+    </w:tr>
+    <w:tr>
+      <w:tc>
+        <w:tcPr>
+          <w:tcW w:type="dxa" w:w="1296"/>
+          <w:vMerge/>
+        </w:tcPr>
+        <w:p/>
+      </w:tc>
+      <w:tc>
+        <w:tcPr>
+          <w:tcW w:type="dxa" w:w="6048"/>
+        </w:tcPr>
+        <w:p>
+          <w:pPr>
+            <w:jc w:val="center"/>
+          </w:pPr>
+          <w:r>
+            <w:rPr>
+              <w:rFonts w:ascii="Times New Roman" w:hAnsi="Times New Roman" w:cs="Times New Roman" w:eastAsia="Times New Roman"/>
+              <w:b/>
+              <w:sz w:val="18"/>
+            </w:rPr>
+            <w:t>26/10/2026</w:t>
+          </w:r>
+        </w:p>
+      </w:tc>
+      <w:tc>
+        <w:tcPr>
+          <w:tcW w:type="dxa" w:w="1296"/>
+          <w:vMerge/>
+        </w:tcPr>
+        <w:p/>
+      </w:tc>
+    </w:tr>
+  </w:tbl>
   <w:p>
     <w:pPr>
       <w:pStyle w:val="Header"/>

</xml_diff>